<commit_message>
fix config meta college and fix app
</commit_message>
<xml_diff>
--- a/template_meta.docx
+++ b/template_meta.docx
@@ -597,8 +597,8 @@
     <w:tbl>
       <w:tblPr>
         <w:tblStyle w:val="ac"/>
-        <w:tblW w:w="3908" w:type="dxa"/>
-        <w:tblInd w:w="6756" w:type="dxa"/>
+        <w:tblW w:w="3719" w:type="dxa"/>
+        <w:tblInd w:w="6189" w:type="dxa"/>
         <w:tblBorders>
           <w:top w:val="none" w:sz="0" w:space="0" w:color="auto"/>
           <w:left w:val="none" w:sz="0" w:space="0" w:color="auto"/>
@@ -610,12 +610,12 @@
         <w:tblLook w:val="04A0" w:firstRow="1" w:lastRow="0" w:firstColumn="1" w:lastColumn="0" w:noHBand="0" w:noVBand="1"/>
       </w:tblPr>
       <w:tblGrid>
-        <w:gridCol w:w="3908"/>
+        <w:gridCol w:w="3719"/>
       </w:tblGrid>
       <w:tr>
         <w:tc>
           <w:tcPr>
-            <w:tcW w:w="3908" w:type="dxa"/>
+            <w:tcW w:w="3719" w:type="dxa"/>
           </w:tcPr>
           <w:p>
             <w:pPr>
@@ -655,7 +655,7 @@
       <w:tr>
         <w:tc>
           <w:tcPr>
-            <w:tcW w:w="3908" w:type="dxa"/>
+            <w:tcW w:w="3719" w:type="dxa"/>
           </w:tcPr>
           <w:p>
             <w:pPr>
@@ -695,7 +695,27 @@
                 <w:szCs w:val="24"/>
                 <w:lang w:val="ru-RU"/>
               </w:rPr>
-              <w:t xml:space="preserve">_____________Дугучиева </w:t>
+              <w:t>_____________</w:t>
+            </w:r>
+            <w:proofErr w:type="spellStart"/>
+            <w:r>
+              <w:rPr>
+                <w:bCs/>
+                <w:sz w:val="24"/>
+                <w:szCs w:val="24"/>
+                <w:lang w:val="ru-RU"/>
+              </w:rPr>
+              <w:t>Дугучиева</w:t>
+            </w:r>
+            <w:proofErr w:type="spellEnd"/>
+            <w:r>
+              <w:rPr>
+                <w:bCs/>
+                <w:sz w:val="24"/>
+                <w:szCs w:val="24"/>
+                <w:lang w:val="ru-RU"/>
+              </w:rPr>
+              <w:t xml:space="preserve"> </w:t>
             </w:r>
             <w:proofErr w:type="gramStart"/>
             <w:r>
@@ -723,7 +743,7 @@
       <w:tr>
         <w:tc>
           <w:tcPr>
-            <w:tcW w:w="3908" w:type="dxa"/>
+            <w:tcW w:w="3719" w:type="dxa"/>
           </w:tcPr>
           <w:p>
             <w:pPr>
@@ -789,7 +809,6 @@
           <w:color w:val="000000" w:themeColor="text1"/>
           <w:sz w:val="28"/>
           <w:szCs w:val="28"/>
-          <w:lang w:val="kk-KZ"/>
         </w:rPr>
       </w:pPr>
       <w:r>

</xml_diff>

<commit_message>
Fix lesson plan generation and registration
</commit_message>
<xml_diff>
--- a/template_meta.docx
+++ b/template_meta.docx
@@ -2931,9 +2931,8 @@
                 <w:b/>
                 <w:sz w:val="24"/>
                 <w:szCs w:val="24"/>
-                <w:lang w:val="en-US"/>
-              </w:rPr>
-              <w:t>{time1}</w:t>
+              </w:rPr>
+              <w:t>5 мин.</w:t>
             </w:r>
             <w:r>
               <w:rPr>
@@ -3010,7 +3009,7 @@
                 <w:rFonts w:ascii="Times New Roman" w:eastAsia="Times New Roman" w:hAnsi="Times New Roman" w:cs="Times New Roman"/>
                 <w:sz w:val="24"/>
                 <w:szCs w:val="24"/>
-                <w:lang w:eastAsia="ru-RU"/>
+                <w:lang w:val="en-US" w:eastAsia="ru-RU"/>
               </w:rPr>
               <w:t>{</w:t>
             </w:r>
@@ -3020,7 +3019,7 @@
                 <w:rFonts w:ascii="Times New Roman" w:eastAsia="Times New Roman" w:hAnsi="Times New Roman" w:cs="Times New Roman"/>
                 <w:sz w:val="24"/>
                 <w:szCs w:val="24"/>
-                <w:lang w:eastAsia="ru-RU"/>
+                <w:lang w:val="en-US" w:eastAsia="ru-RU"/>
               </w:rPr>
               <w:t>presentation_resource</w:t>
             </w:r>
@@ -3030,7 +3029,7 @@
                 <w:rFonts w:ascii="Times New Roman" w:eastAsia="Times New Roman" w:hAnsi="Times New Roman" w:cs="Times New Roman"/>
                 <w:sz w:val="24"/>
                 <w:szCs w:val="24"/>
-                <w:lang w:eastAsia="ru-RU"/>
+                <w:lang w:val="en-US" w:eastAsia="ru-RU"/>
               </w:rPr>
               <w:t>}</w:t>
             </w:r>
@@ -3080,27 +3079,28 @@
                 <w:szCs w:val="24"/>
                 <w:lang w:val="en-US" w:eastAsia="ru-RU"/>
               </w:rPr>
-              <w:t>}</w:t>
-            </w:r>
-            <w:r>
+              <w:t>}.</w:t>
+            </w:r>
+          </w:p>
+          <w:p>
+            <w:pPr>
               <w:rPr>
                 <w:rFonts w:ascii="Times New Roman" w:eastAsia="Times New Roman" w:hAnsi="Times New Roman" w:cs="Times New Roman"/>
                 <w:sz w:val="24"/>
                 <w:szCs w:val="24"/>
                 <w:lang w:val="en-US" w:eastAsia="ru-RU"/>
               </w:rPr>
-              <w:t>.</w:t>
-            </w:r>
-          </w:p>
-          <w:p>
-            <w:pPr>
+            </w:pPr>
+            <w:r>
               <w:rPr>
                 <w:rFonts w:ascii="Times New Roman" w:eastAsia="Times New Roman" w:hAnsi="Times New Roman" w:cs="Times New Roman"/>
                 <w:sz w:val="24"/>
                 <w:szCs w:val="24"/>
                 <w:lang w:val="en-US" w:eastAsia="ru-RU"/>
               </w:rPr>
-            </w:pPr>
+              <w:t>{</w:t>
+            </w:r>
+            <w:proofErr w:type="spellStart"/>
             <w:r>
               <w:rPr>
                 <w:rFonts w:ascii="Times New Roman" w:eastAsia="Times New Roman" w:hAnsi="Times New Roman" w:cs="Times New Roman"/>
@@ -3108,6 +3108,35 @@
                 <w:szCs w:val="24"/>
                 <w:lang w:val="en-US" w:eastAsia="ru-RU"/>
               </w:rPr>
+              <w:t>presentation_demo</w:t>
+            </w:r>
+            <w:proofErr w:type="spellEnd"/>
+            <w:r>
+              <w:rPr>
+                <w:rFonts w:ascii="Times New Roman" w:eastAsia="Times New Roman" w:hAnsi="Times New Roman" w:cs="Times New Roman"/>
+                <w:sz w:val="24"/>
+                <w:szCs w:val="24"/>
+                <w:lang w:val="en-US" w:eastAsia="ru-RU"/>
+              </w:rPr>
+              <w:t>}.</w:t>
+            </w:r>
+          </w:p>
+          <w:p>
+            <w:pPr>
+              <w:rPr>
+                <w:rFonts w:ascii="Times New Roman" w:eastAsia="Times New Roman" w:hAnsi="Times New Roman" w:cs="Times New Roman"/>
+                <w:sz w:val="24"/>
+                <w:szCs w:val="24"/>
+                <w:lang w:val="en-US" w:eastAsia="ru-RU"/>
+              </w:rPr>
+            </w:pPr>
+            <w:r>
+              <w:rPr>
+                <w:rFonts w:ascii="Times New Roman" w:eastAsia="Times New Roman" w:hAnsi="Times New Roman" w:cs="Times New Roman"/>
+                <w:sz w:val="24"/>
+                <w:szCs w:val="24"/>
+                <w:lang w:val="en-US" w:eastAsia="ru-RU"/>
+              </w:rPr>
               <w:t>{</w:t>
             </w:r>
             <w:proofErr w:type="spellStart"/>
@@ -3118,7 +3147,7 @@
                 <w:szCs w:val="24"/>
                 <w:lang w:val="en-US" w:eastAsia="ru-RU"/>
               </w:rPr>
-              <w:t>presentation_demo</w:t>
+              <w:t>practice_result</w:t>
             </w:r>
             <w:proofErr w:type="spellEnd"/>
             <w:r>
@@ -3128,27 +3157,28 @@
                 <w:szCs w:val="24"/>
                 <w:lang w:val="en-US" w:eastAsia="ru-RU"/>
               </w:rPr>
-              <w:t>}</w:t>
-            </w:r>
-            <w:r>
+              <w:t>}.</w:t>
+            </w:r>
+          </w:p>
+          <w:p>
+            <w:pPr>
               <w:rPr>
                 <w:rFonts w:ascii="Times New Roman" w:eastAsia="Times New Roman" w:hAnsi="Times New Roman" w:cs="Times New Roman"/>
                 <w:sz w:val="24"/>
                 <w:szCs w:val="24"/>
                 <w:lang w:val="en-US" w:eastAsia="ru-RU"/>
               </w:rPr>
-              <w:t>.</w:t>
-            </w:r>
-          </w:p>
-          <w:p>
-            <w:pPr>
+            </w:pPr>
+            <w:r>
               <w:rPr>
                 <w:rFonts w:ascii="Times New Roman" w:eastAsia="Times New Roman" w:hAnsi="Times New Roman" w:cs="Times New Roman"/>
                 <w:sz w:val="24"/>
                 <w:szCs w:val="24"/>
                 <w:lang w:val="en-US" w:eastAsia="ru-RU"/>
               </w:rPr>
-            </w:pPr>
+              <w:t>{</w:t>
+            </w:r>
+            <w:proofErr w:type="spellStart"/>
             <w:r>
               <w:rPr>
                 <w:rFonts w:ascii="Times New Roman" w:eastAsia="Times New Roman" w:hAnsi="Times New Roman" w:cs="Times New Roman"/>
@@ -3156,6 +3186,36 @@
                 <w:szCs w:val="24"/>
                 <w:lang w:val="en-US" w:eastAsia="ru-RU"/>
               </w:rPr>
+              <w:t>peer_assessment</w:t>
+            </w:r>
+            <w:proofErr w:type="spellEnd"/>
+            <w:r>
+              <w:rPr>
+                <w:rFonts w:ascii="Times New Roman" w:eastAsia="Times New Roman" w:hAnsi="Times New Roman" w:cs="Times New Roman"/>
+                <w:sz w:val="24"/>
+                <w:szCs w:val="24"/>
+                <w:lang w:val="en-US" w:eastAsia="ru-RU"/>
+              </w:rPr>
+              <w:t>}.</w:t>
+            </w:r>
+          </w:p>
+          <w:p>
+            <w:pPr>
+              <w:rPr>
+                <w:rFonts w:ascii="Times New Roman" w:eastAsia="Times New Roman" w:hAnsi="Times New Roman" w:cs="Times New Roman"/>
+                <w:vanish/>
+                <w:sz w:val="24"/>
+                <w:szCs w:val="24"/>
+                <w:lang w:val="en-US" w:eastAsia="ru-RU"/>
+              </w:rPr>
+            </w:pPr>
+            <w:r>
+              <w:rPr>
+                <w:rFonts w:ascii="Times New Roman" w:eastAsia="Times New Roman" w:hAnsi="Times New Roman" w:cs="Times New Roman"/>
+                <w:sz w:val="24"/>
+                <w:szCs w:val="24"/>
+                <w:lang w:val="en-US" w:eastAsia="ru-RU"/>
+              </w:rPr>
               <w:t>{</w:t>
             </w:r>
             <w:proofErr w:type="spellStart"/>
@@ -3166,7 +3226,7 @@
                 <w:szCs w:val="24"/>
                 <w:lang w:val="en-US" w:eastAsia="ru-RU"/>
               </w:rPr>
-              <w:t>practice_result</w:t>
+              <w:t>assessment_sheet</w:t>
             </w:r>
             <w:proofErr w:type="spellEnd"/>
             <w:r>
@@ -3176,146 +3236,40 @@
                 <w:szCs w:val="24"/>
                 <w:lang w:val="en-US" w:eastAsia="ru-RU"/>
               </w:rPr>
-              <w:t>}</w:t>
-            </w:r>
-            <w:r>
-              <w:rPr>
-                <w:rFonts w:ascii="Times New Roman" w:eastAsia="Times New Roman" w:hAnsi="Times New Roman" w:cs="Times New Roman"/>
+              <w:t>}.</w:t>
+            </w:r>
+          </w:p>
+          <w:p>
+            <w:pPr>
+              <w:rPr>
+                <w:rFonts w:ascii="Times New Roman" w:eastAsia="Times New Roman" w:hAnsi="Times New Roman" w:cs="Times New Roman"/>
+                <w:vanish/>
                 <w:sz w:val="24"/>
                 <w:szCs w:val="24"/>
                 <w:lang w:val="en-US" w:eastAsia="ru-RU"/>
               </w:rPr>
-              <w:t>.</w:t>
-            </w:r>
-          </w:p>
-          <w:p>
-            <w:pPr>
-              <w:rPr>
-                <w:rFonts w:ascii="Times New Roman" w:eastAsia="Times New Roman" w:hAnsi="Times New Roman" w:cs="Times New Roman"/>
+            </w:pPr>
+          </w:p>
+          <w:p>
+            <w:pPr>
+              <w:rPr>
+                <w:rFonts w:ascii="Times New Roman" w:eastAsia="Times New Roman" w:hAnsi="Times New Roman" w:cs="Times New Roman"/>
+                <w:vanish/>
                 <w:sz w:val="24"/>
                 <w:szCs w:val="24"/>
                 <w:lang w:val="en-US" w:eastAsia="ru-RU"/>
               </w:rPr>
             </w:pPr>
-            <w:r>
-              <w:rPr>
-                <w:rFonts w:ascii="Times New Roman" w:eastAsia="Times New Roman" w:hAnsi="Times New Roman" w:cs="Times New Roman"/>
+          </w:p>
+          <w:p>
+            <w:pPr>
+              <w:rPr>
+                <w:rFonts w:ascii="Times New Roman" w:eastAsia="Times New Roman" w:hAnsi="Times New Roman" w:cs="Times New Roman"/>
+                <w:vanish/>
                 <w:sz w:val="24"/>
                 <w:szCs w:val="24"/>
                 <w:lang w:val="en-US" w:eastAsia="ru-RU"/>
               </w:rPr>
-              <w:t>{</w:t>
-            </w:r>
-            <w:proofErr w:type="spellStart"/>
-            <w:r>
-              <w:rPr>
-                <w:rFonts w:ascii="Times New Roman" w:eastAsia="Times New Roman" w:hAnsi="Times New Roman" w:cs="Times New Roman"/>
-                <w:sz w:val="24"/>
-                <w:szCs w:val="24"/>
-                <w:lang w:val="en-US" w:eastAsia="ru-RU"/>
-              </w:rPr>
-              <w:t>peer_assessment</w:t>
-            </w:r>
-            <w:proofErr w:type="spellEnd"/>
-            <w:r>
-              <w:rPr>
-                <w:rFonts w:ascii="Times New Roman" w:eastAsia="Times New Roman" w:hAnsi="Times New Roman" w:cs="Times New Roman"/>
-                <w:sz w:val="24"/>
-                <w:szCs w:val="24"/>
-                <w:lang w:val="en-US" w:eastAsia="ru-RU"/>
-              </w:rPr>
-              <w:t>}</w:t>
-            </w:r>
-            <w:r>
-              <w:rPr>
-                <w:rFonts w:ascii="Times New Roman" w:eastAsia="Times New Roman" w:hAnsi="Times New Roman" w:cs="Times New Roman"/>
-                <w:sz w:val="24"/>
-                <w:szCs w:val="24"/>
-                <w:lang w:val="en-US" w:eastAsia="ru-RU"/>
-              </w:rPr>
-              <w:t>.</w:t>
-            </w:r>
-          </w:p>
-          <w:p>
-            <w:pPr>
-              <w:rPr>
-                <w:rFonts w:ascii="Times New Roman" w:eastAsia="Times New Roman" w:hAnsi="Times New Roman" w:cs="Times New Roman"/>
-                <w:vanish/>
-                <w:sz w:val="24"/>
-                <w:szCs w:val="24"/>
-                <w:lang w:val="en-US" w:eastAsia="ru-RU"/>
-              </w:rPr>
-            </w:pPr>
-            <w:r>
-              <w:rPr>
-                <w:rFonts w:ascii="Times New Roman" w:eastAsia="Times New Roman" w:hAnsi="Times New Roman" w:cs="Times New Roman"/>
-                <w:sz w:val="24"/>
-                <w:szCs w:val="24"/>
-                <w:lang w:val="en-US" w:eastAsia="ru-RU"/>
-              </w:rPr>
-              <w:t>{</w:t>
-            </w:r>
-            <w:proofErr w:type="spellStart"/>
-            <w:r>
-              <w:rPr>
-                <w:rFonts w:ascii="Times New Roman" w:eastAsia="Times New Roman" w:hAnsi="Times New Roman" w:cs="Times New Roman"/>
-                <w:sz w:val="24"/>
-                <w:szCs w:val="24"/>
-                <w:lang w:val="en-US" w:eastAsia="ru-RU"/>
-              </w:rPr>
-              <w:t>assessment_sheet</w:t>
-            </w:r>
-            <w:proofErr w:type="spellEnd"/>
-            <w:r>
-              <w:rPr>
-                <w:rFonts w:ascii="Times New Roman" w:eastAsia="Times New Roman" w:hAnsi="Times New Roman" w:cs="Times New Roman"/>
-                <w:sz w:val="24"/>
-                <w:szCs w:val="24"/>
-                <w:lang w:val="en-US" w:eastAsia="ru-RU"/>
-              </w:rPr>
-              <w:t>}</w:t>
-            </w:r>
-            <w:r>
-              <w:rPr>
-                <w:rFonts w:ascii="Times New Roman" w:eastAsia="Times New Roman" w:hAnsi="Times New Roman" w:cs="Times New Roman"/>
-                <w:sz w:val="24"/>
-                <w:szCs w:val="24"/>
-                <w:lang w:val="en-US" w:eastAsia="ru-RU"/>
-              </w:rPr>
-              <w:t>.</w:t>
-            </w:r>
-          </w:p>
-          <w:p>
-            <w:pPr>
-              <w:rPr>
-                <w:rFonts w:ascii="Times New Roman" w:eastAsia="Times New Roman" w:hAnsi="Times New Roman" w:cs="Times New Roman"/>
-                <w:vanish/>
-                <w:sz w:val="24"/>
-                <w:szCs w:val="24"/>
-                <w:lang w:eastAsia="ru-RU"/>
-              </w:rPr>
-            </w:pPr>
-          </w:p>
-          <w:p>
-            <w:pPr>
-              <w:rPr>
-                <w:rFonts w:ascii="Times New Roman" w:eastAsia="Times New Roman" w:hAnsi="Times New Roman" w:cs="Times New Roman"/>
-                <w:vanish/>
-                <w:sz w:val="24"/>
-                <w:szCs w:val="24"/>
-                <w:lang w:eastAsia="ru-RU"/>
-              </w:rPr>
-            </w:pPr>
-          </w:p>
-          <w:p>
-            <w:pPr>
-              <w:rPr>
-                <w:rFonts w:ascii="Times New Roman" w:eastAsia="Times New Roman" w:hAnsi="Times New Roman" w:cs="Times New Roman"/>
-                <w:vanish/>
-                <w:sz w:val="24"/>
-                <w:szCs w:val="24"/>
-                <w:lang w:eastAsia="ru-RU"/>
-              </w:rPr>
             </w:pPr>
           </w:p>
           <w:p>
@@ -3326,6 +3280,7 @@
                 <w:sz w:val="24"/>
                 <w:szCs w:val="24"/>
                 <w:highlight w:val="yellow"/>
+                <w:lang w:val="en-US"/>
               </w:rPr>
             </w:pPr>
           </w:p>
@@ -3358,8 +3313,18 @@
                 <w:b/>
                 <w:sz w:val="24"/>
                 <w:szCs w:val="24"/>
-              </w:rPr>
-              <w:t xml:space="preserve"> Актуализация знаний</w:t>
+                <w:lang w:val="en-US"/>
+              </w:rPr>
+              <w:t xml:space="preserve"> </w:t>
+            </w:r>
+            <w:r>
+              <w:rPr>
+                <w:rFonts w:ascii="Times New Roman" w:hAnsi="Times New Roman" w:cs="Times New Roman"/>
+                <w:b/>
+                <w:sz w:val="24"/>
+                <w:szCs w:val="24"/>
+              </w:rPr>
+              <w:t>Актуализация знаний</w:t>
             </w:r>
           </w:p>
           <w:p>
@@ -3388,9 +3353,8 @@
                 <w:b/>
                 <w:sz w:val="24"/>
                 <w:szCs w:val="24"/>
-                <w:lang w:val="en-US"/>
-              </w:rPr>
-              <w:t>{time2}</w:t>
+              </w:rPr>
+              <w:t>5 мин.</w:t>
             </w:r>
             <w:r>
               <w:rPr>
@@ -3506,9 +3470,8 @@
                 <w:b/>
                 <w:sz w:val="24"/>
                 <w:szCs w:val="24"/>
-                <w:lang w:val="en-US"/>
-              </w:rPr>
-              <w:t>{time3}</w:t>
+              </w:rPr>
+              <w:t>20 мин.</w:t>
             </w:r>
             <w:r>
               <w:rPr>
@@ -3648,9 +3611,9 @@
                 <w:b/>
                 <w:sz w:val="24"/>
                 <w:szCs w:val="24"/>
-                <w:lang w:val="en-US" w:eastAsia="ru-RU"/>
-              </w:rPr>
-              <w:t>{time4}</w:t>
+                <w:lang w:eastAsia="ru-RU"/>
+              </w:rPr>
+              <w:t>20 мин.</w:t>
             </w:r>
             <w:r>
               <w:rPr>
@@ -3807,26 +3770,7 @@
                 <w:sz w:val="24"/>
                 <w:szCs w:val="24"/>
               </w:rPr>
-              <w:t>{</w:t>
-            </w:r>
-            <w:r>
-              <w:rPr>
-                <w:rFonts w:ascii="Times New Roman" w:hAnsi="Times New Roman" w:cs="Times New Roman"/>
-                <w:b/>
-                <w:sz w:val="24"/>
-                <w:szCs w:val="24"/>
-                <w:lang w:val="en-US"/>
-              </w:rPr>
-              <w:t>time</w:t>
-            </w:r>
-            <w:r>
-              <w:rPr>
-                <w:rFonts w:ascii="Times New Roman" w:hAnsi="Times New Roman" w:cs="Times New Roman"/>
-                <w:b/>
-                <w:sz w:val="24"/>
-                <w:szCs w:val="24"/>
-              </w:rPr>
-              <w:t>7}</w:t>
+              <w:t>5 мин.</w:t>
             </w:r>
             <w:r>
               <w:rPr>
@@ -4036,26 +3980,7 @@
                 <w:sz w:val="24"/>
                 <w:szCs w:val="24"/>
               </w:rPr>
-              <w:t>{</w:t>
-            </w:r>
-            <w:r>
-              <w:rPr>
-                <w:rFonts w:ascii="Times New Roman" w:hAnsi="Times New Roman" w:cs="Times New Roman"/>
-                <w:b/>
-                <w:sz w:val="24"/>
-                <w:szCs w:val="24"/>
-                <w:lang w:val="en-US"/>
-              </w:rPr>
-              <w:t>time</w:t>
-            </w:r>
-            <w:r>
-              <w:rPr>
-                <w:rFonts w:ascii="Times New Roman" w:hAnsi="Times New Roman" w:cs="Times New Roman"/>
-                <w:b/>
-                <w:sz w:val="24"/>
-                <w:szCs w:val="24"/>
-              </w:rPr>
-              <w:t>5}</w:t>
+              <w:t>2 мин.</w:t>
             </w:r>
             <w:r>
               <w:rPr>
@@ -4182,9 +4107,8 @@
                 <w:b/>
                 <w:sz w:val="24"/>
                 <w:szCs w:val="24"/>
-                <w:lang w:val="en-US"/>
-              </w:rPr>
-              <w:t>{time7}</w:t>
+              </w:rPr>
+              <w:t>3 мин.</w:t>
             </w:r>
             <w:r>
               <w:rPr>

</xml_diff>